<commit_message>
Penambaan login dan product api responsive
</commit_message>
<xml_diff>
--- a/P9_FSWD3_RIZKY JEIN NUR AULIA.docx
+++ b/P9_FSWD3_RIZKY JEIN NUR AULIA.docx
@@ -1176,26 +1176,17 @@
           <w:szCs w:val="24"/>
         </w:rPr>
       </w:pPr>
-    </w:p>
-    <w:p>
-      <w:pPr>
-        <w:spacing w:line="360" w:lineRule="auto"/>
-        <w:jc w:val="center"/>
-        <w:rPr>
-          <w:rFonts w:ascii="Times New Roman" w:hAnsi="Times New Roman" w:cs="Times New Roman"/>
-          <w:sz w:val="24"/>
-          <w:szCs w:val="24"/>
-        </w:rPr>
-      </w:pPr>
-      <w:r>
-        <w:rPr>
-          <w:noProof/>
+      <w:r>
+        <w:rPr>
+          <w:rFonts w:ascii="Times New Roman" w:hAnsi="Times New Roman" w:cs="Times New Roman"/>
+          <w:sz w:val="24"/>
+          <w:szCs w:val="24"/>
         </w:rPr>
         <w:drawing>
-          <wp:inline distT="0" distB="0" distL="0" distR="0" wp14:anchorId="57C0F8A6" wp14:editId="75F4001A">
-            <wp:extent cx="2009775" cy="2767819"/>
+          <wp:inline distT="0" distB="0" distL="0" distR="0" wp14:anchorId="3645CCFA" wp14:editId="30EF27AD">
+            <wp:extent cx="5247640" cy="1985010"/>
             <wp:effectExtent l="0" t="0" r="0" b="0"/>
-            <wp:docPr id="3" name="Picture 3"/>
+            <wp:docPr id="9" name="Picture 9"/>
             <wp:cNvGraphicFramePr>
               <a:graphicFrameLocks xmlns:a="http://schemas.openxmlformats.org/drawingml/2006/main" noChangeAspect="1"/>
             </wp:cNvGraphicFramePr>
@@ -1215,7 +1206,7 @@
                   <pic:spPr>
                     <a:xfrm>
                       <a:off x="0" y="0"/>
-                      <a:ext cx="2014510" cy="2774340"/>
+                      <a:ext cx="5247640" cy="1985010"/>
                     </a:xfrm>
                     <a:prstGeom prst="rect">
                       <a:avLst/>
@@ -1243,10 +1234,10 @@
           <w:noProof/>
         </w:rPr>
         <w:drawing>
-          <wp:inline distT="0" distB="0" distL="0" distR="0" wp14:anchorId="490D5C42" wp14:editId="539B13CE">
-            <wp:extent cx="1395431" cy="3467100"/>
-            <wp:effectExtent l="0" t="0" r="0" b="0"/>
-            <wp:docPr id="4" name="Picture 4"/>
+          <wp:inline distT="0" distB="0" distL="0" distR="0" wp14:anchorId="57C0F8A6" wp14:editId="67433675">
+            <wp:extent cx="3347496" cy="4610100"/>
+            <wp:effectExtent l="0" t="0" r="5715" b="0"/>
+            <wp:docPr id="3" name="Picture 3"/>
             <wp:cNvGraphicFramePr>
               <a:graphicFrameLocks xmlns:a="http://schemas.openxmlformats.org/drawingml/2006/main" noChangeAspect="1"/>
             </wp:cNvGraphicFramePr>
@@ -1266,7 +1257,7 @@
                   <pic:spPr>
                     <a:xfrm>
                       <a:off x="0" y="0"/>
-                      <a:ext cx="1408203" cy="3498834"/>
+                      <a:ext cx="3363007" cy="4631461"/>
                     </a:xfrm>
                     <a:prstGeom prst="rect">
                       <a:avLst/>
@@ -1295,10 +1286,10 @@
         </w:rPr>
         <w:lastRenderedPageBreak/>
         <w:drawing>
-          <wp:inline distT="0" distB="0" distL="0" distR="0" wp14:anchorId="75868E28" wp14:editId="496369DD">
-            <wp:extent cx="914400" cy="3620975"/>
+          <wp:inline distT="0" distB="0" distL="0" distR="0" wp14:anchorId="490D5C42" wp14:editId="539B13CE">
+            <wp:extent cx="1395431" cy="3467100"/>
             <wp:effectExtent l="0" t="0" r="0" b="0"/>
-            <wp:docPr id="6" name="Picture 6"/>
+            <wp:docPr id="4" name="Picture 4"/>
             <wp:cNvGraphicFramePr>
               <a:graphicFrameLocks xmlns:a="http://schemas.openxmlformats.org/drawingml/2006/main" noChangeAspect="1"/>
             </wp:cNvGraphicFramePr>
@@ -1318,6 +1309,57 @@
                   <pic:spPr>
                     <a:xfrm>
                       <a:off x="0" y="0"/>
+                      <a:ext cx="1408203" cy="3498834"/>
+                    </a:xfrm>
+                    <a:prstGeom prst="rect">
+                      <a:avLst/>
+                    </a:prstGeom>
+                  </pic:spPr>
+                </pic:pic>
+              </a:graphicData>
+            </a:graphic>
+          </wp:inline>
+        </w:drawing>
+      </w:r>
+    </w:p>
+    <w:p>
+      <w:pPr>
+        <w:spacing w:line="360" w:lineRule="auto"/>
+        <w:jc w:val="center"/>
+        <w:rPr>
+          <w:rFonts w:ascii="Times New Roman" w:hAnsi="Times New Roman" w:cs="Times New Roman"/>
+          <w:sz w:val="24"/>
+          <w:szCs w:val="24"/>
+        </w:rPr>
+      </w:pPr>
+      <w:r>
+        <w:rPr>
+          <w:noProof/>
+        </w:rPr>
+        <w:drawing>
+          <wp:inline distT="0" distB="0" distL="0" distR="0" wp14:anchorId="75868E28" wp14:editId="496369DD">
+            <wp:extent cx="914400" cy="3620975"/>
+            <wp:effectExtent l="0" t="0" r="0" b="0"/>
+            <wp:docPr id="6" name="Picture 6"/>
+            <wp:cNvGraphicFramePr>
+              <a:graphicFrameLocks xmlns:a="http://schemas.openxmlformats.org/drawingml/2006/main" noChangeAspect="1"/>
+            </wp:cNvGraphicFramePr>
+            <a:graphic xmlns:a="http://schemas.openxmlformats.org/drawingml/2006/main">
+              <a:graphicData uri="http://schemas.openxmlformats.org/drawingml/2006/picture">
+                <pic:pic xmlns:pic="http://schemas.openxmlformats.org/drawingml/2006/picture">
+                  <pic:nvPicPr>
+                    <pic:cNvPr id="1" name=""/>
+                    <pic:cNvPicPr/>
+                  </pic:nvPicPr>
+                  <pic:blipFill>
+                    <a:blip r:embed="rId15"/>
+                    <a:stretch>
+                      <a:fillRect/>
+                    </a:stretch>
+                  </pic:blipFill>
+                  <pic:spPr>
+                    <a:xfrm>
+                      <a:off x="0" y="0"/>
                       <a:ext cx="916265" cy="3628358"/>
                     </a:xfrm>
                     <a:prstGeom prst="rect">
@@ -1334,45 +1376,6 @@
     <w:p>
       <w:pPr>
         <w:spacing w:line="360" w:lineRule="auto"/>
-        <w:jc w:val="center"/>
-        <w:rPr>
-          <w:rFonts w:ascii="Times New Roman" w:hAnsi="Times New Roman" w:cs="Times New Roman"/>
-          <w:sz w:val="24"/>
-          <w:szCs w:val="24"/>
-        </w:rPr>
-      </w:pPr>
-    </w:p>
-    <w:p>
-      <w:pPr>
-        <w:spacing w:line="360" w:lineRule="auto"/>
-        <w:jc w:val="center"/>
-        <w:rPr>
-          <w:rFonts w:ascii="Times New Roman" w:hAnsi="Times New Roman" w:cs="Times New Roman"/>
-          <w:sz w:val="24"/>
-          <w:szCs w:val="24"/>
-        </w:rPr>
-      </w:pPr>
-    </w:p>
-    <w:p>
-      <w:pPr>
-        <w:rPr>
-          <w:rFonts w:ascii="Times New Roman" w:hAnsi="Times New Roman" w:cs="Times New Roman"/>
-          <w:sz w:val="24"/>
-          <w:szCs w:val="24"/>
-        </w:rPr>
-      </w:pPr>
-      <w:r>
-        <w:rPr>
-          <w:rFonts w:ascii="Times New Roman" w:hAnsi="Times New Roman" w:cs="Times New Roman"/>
-          <w:sz w:val="24"/>
-          <w:szCs w:val="24"/>
-        </w:rPr>
-        <w:br w:type="page"/>
-      </w:r>
-    </w:p>
-    <w:p>
-      <w:pPr>
-        <w:spacing w:line="360" w:lineRule="auto"/>
         <w:jc w:val="both"/>
         <w:rPr>
           <w:rFonts w:ascii="Times New Roman" w:hAnsi="Times New Roman" w:cs="Times New Roman"/>
@@ -1395,7 +1398,7 @@
         <w:spacing w:line="360" w:lineRule="auto"/>
         <w:jc w:val="both"/>
       </w:pPr>
-      <w:hyperlink r:id="rId15" w:history="1">
+      <w:hyperlink r:id="rId16" w:history="1">
         <w:r>
           <w:rPr>
             <w:rStyle w:val="Hyperlink"/>

</xml_diff>